<commit_message>
Co-authors added (Prathima Tirumalareddy, A Sirisha); reference [6] fixed; no repeated-author dashes; Word references numbered
Co-Authored-By: Claude Opus 5.5 <noreply@anthropic.com>
Claude-Session: https://claude.ai/code/session_01PGagwcaCk7Ur7S4q92P2S5
</commit_message>
<xml_diff>
--- a/paper/word/Koopman_Linux_Scheduler_Paper.docx
+++ b/paper/word/Koopman_Linux_Scheduler_Paper.docx
@@ -77,13 +77,55 @@
         <w:t xml:space="preserve"> </w:t>
       </w:r>
       <w:r>
-        <w:t xml:space="preserve">Manocha</w:t>
+        <w:t xml:space="preserve">Manocha,</w:t>
+      </w:r>
+      <w:r>
+        <w:t xml:space="preserve"> </w:t>
+      </w:r>
+      <w:r>
+        <w:t xml:space="preserve">Prathima</w:t>
+      </w:r>
+      <w:r>
+        <w:t xml:space="preserve"> </w:t>
+      </w:r>
+      <w:r>
+        <w:t xml:space="preserve">Tirumalareddy</w:t>
+      </w:r>
+      <w:r>
+        <w:t xml:space="preserve"> </w:t>
+      </w:r>
+      <w:r>
+        <w:t xml:space="preserve">and</w:t>
+      </w:r>
+      <w:r>
+        <w:t xml:space="preserve"> </w:t>
+      </w:r>
+      <w:r>
+        <w:t xml:space="preserve">A</w:t>
+      </w:r>
+      <w:r>
+        <w:t xml:space="preserve"> </w:t>
+      </w:r>
+      <w:r>
+        <w:t xml:space="preserve">Sirisha</w:t>
       </w:r>
       <w:r>
         <w:br/>
       </w:r>
       <w:r>
-        <w:t xml:space="preserve">Dept.</w:t>
+        <w:t xml:space="preserve">Chaitanya</w:t>
+      </w:r>
+      <w:r>
+        <w:t xml:space="preserve"> </w:t>
+      </w:r>
+      <w:r>
+        <w:t xml:space="preserve">Bharathi</w:t>
+      </w:r>
+      <w:r>
+        <w:t xml:space="preserve"> </w:t>
+      </w:r>
+      <w:r>
+        <w:t xml:space="preserve">Institute</w:t>
       </w:r>
       <w:r>
         <w:t xml:space="preserve"> </w:t>
@@ -95,48 +137,12 @@
         <w:t xml:space="preserve"> </w:t>
       </w:r>
       <w:r>
-        <w:t xml:space="preserve">Information</w:t>
-      </w:r>
-      <w:r>
-        <w:t xml:space="preserve"> </w:t>
-      </w:r>
-      <w:r>
         <w:t xml:space="preserve">Technology,</w:t>
       </w:r>
       <w:r>
         <w:t xml:space="preserve"> </w:t>
       </w:r>
       <w:r>
-        <w:t xml:space="preserve">Chaitanya</w:t>
-      </w:r>
-      <w:r>
-        <w:t xml:space="preserve"> </w:t>
-      </w:r>
-      <w:r>
-        <w:t xml:space="preserve">Bharathi</w:t>
-      </w:r>
-      <w:r>
-        <w:t xml:space="preserve"> </w:t>
-      </w:r>
-      <w:r>
-        <w:t xml:space="preserve">Institute</w:t>
-      </w:r>
-      <w:r>
-        <w:t xml:space="preserve"> </w:t>
-      </w:r>
-      <w:r>
-        <w:t xml:space="preserve">of</w:t>
-      </w:r>
-      <w:r>
-        <w:t xml:space="preserve"> </w:t>
-      </w:r>
-      <w:r>
-        <w:t xml:space="preserve">Technology,</w:t>
-      </w:r>
-      <w:r>
-        <w:t xml:space="preserve"> </w:t>
-      </w:r>
-      <w:r>
         <w:t xml:space="preserve">Hyderabad,</w:t>
       </w:r>
       <w:r>
@@ -149,7 +155,19 @@
         <w:br/>
       </w:r>
       <w:r>
-        <w:t xml:space="preserve">saarthakmanocha@gmail.com</w:t>
+        <w:t xml:space="preserve">saarthakmanocha@gmail.com,</w:t>
+      </w:r>
+      <w:r>
+        <w:t xml:space="preserve"> </w:t>
+      </w:r>
+      <w:r>
+        <w:t xml:space="preserve">prathimareddy.t@gmail.com,</w:t>
+      </w:r>
+      <w:r>
+        <w:t xml:space="preserve"> </w:t>
+      </w:r>
+      <w:r>
+        <w:t xml:space="preserve">asirishanaidu@gmail.com</w:t>
       </w:r>
     </w:p>
     <w:p>
@@ -2124,7 +2142,7 @@
         <w:t xml:space="preserve"> </w:t>
       </w:r>
       <w:r>
-        <w:t xml:space="preserve">system call, and a shorter slice gives it an earlier virtual deadline and the right to preempt tasks with longer slices [6], [7]. This turns burst prediction from a textbook exercise into a lever on a production scheduler. If a task’s next burst is known to be short, its slice can be set short, and EEVDF will serve it sooner; that is SJF expressed inside the stock kernel, with no patch and no new scheduling class. Whether this works depends on two questions that, to the author’s knowledge, have not been answered with real kernel data: how well can bursts be predicted, and does a better prediction make the real scheduler faster?</w:t>
+        <w:t xml:space="preserve">system call, and a shorter slice gives it an earlier virtual deadline and the right to preempt tasks with longer slices [6], [7]. This turns burst prediction from a textbook exercise into a lever on a production scheduler. If a task’s next burst is known to be short, its slice can be set short, and EEVDF will serve it sooner; that is SJF expressed inside the stock kernel, with no patch and no new scheduling class. Whether this works depends on two questions that, to the authors’ knowledge, have not been answered with real kernel data: how well can bursts be predicted, and does a better prediction make the real scheduler faster?</w:t>
       </w:r>
     </w:p>
     <w:p>
@@ -4279,7 +4297,7 @@
         <w:t xml:space="preserve"> </w:t>
       </w:r>
       <w:r>
-        <w:t xml:space="preserve">Koopman operators have been applied to prediction and control of physical and financial systems [22], [23], [24], [10]. The relation between DMD on delay coordinates and autoregressive models is known [13], [14], and classical time-series practice selects the autoregressive order by information criteria [33], [34]. The author is not aware of Koopman methods applied to operating-system scheduling; this paper tests the method against these classical alternatives rather than assuming an advantage.</w:t>
+        <w:t xml:space="preserve">Koopman operators have been applied to prediction and control of physical and financial systems [22], [23], [24], [10]. The relation between DMD on delay coordinates and autoregressive models is known [13], [14], and classical time-series practice selects the autoregressive order by information criteria [33], [34]. The authors are not aware of Koopman methods applied to operating-system scheduling; this paper tests the method against these classical alternatives rather than assuming an advantage.</w:t>
       </w:r>
     </w:p>
     <w:bookmarkEnd w:id="26"/>
@@ -20619,7 +20637,13 @@
         <w:pStyle w:val="FirstParagraph"/>
       </w:pPr>
       <w:r>
-        <w:t xml:space="preserve">A. Silberschatz, P. B. Galvin, and G. Gagne,</w:t>
+        <w:t>[1</w:t>
+      </w:r>
+      <w:r>
+        <w:t xml:space="preserve">]</w:t>
+      </w:r>
+      <w:r>
+        <w:t xml:space="preserve"> A. Silberschatz, P. B. Galvin, and G. Gagne,</w:t>
       </w:r>
       <w:r>
         <w:t xml:space="preserve"> </w:t>
@@ -20640,7 +20664,13 @@
         <w:pStyle w:val="BodyText"/>
       </w:pPr>
       <w:r>
-        <w:t xml:space="preserve">A. S. Tanenbaum and H. Bos,</w:t>
+        <w:t>[2</w:t>
+      </w:r>
+      <w:r>
+        <w:t xml:space="preserve">]</w:t>
+      </w:r>
+      <w:r>
+        <w:t xml:space="preserve"> A. S. Tanenbaum and H. Bos,</w:t>
       </w:r>
       <w:r>
         <w:t xml:space="preserve"> </w:t>
@@ -20660,6 +20690,18 @@
       <w:pPr>
         <w:pStyle w:val="BodyText"/>
       </w:pPr>
+      <w:r>
+        <w:t>[3</w:t>
+      </w:r>
+      <w:r>
+        <w:t xml:space="preserve">]</w:t>
+      </w:r>
+      <w:r>
+        <w:t xml:space="preserve"> </w:t>
+      </w:r>
+      <w:r>
+        <w:t xml:space="preserve">The Linux kernel documentation</w:t>
+      </w:r>
       <w:r>
         <w:t xml:space="preserve">,</w:t>
       </w:r>
@@ -20701,7 +20743,13 @@
         <w:pStyle w:val="BodyText"/>
       </w:pPr>
       <w:r>
-        <w:t xml:space="preserve">I. Stoica and H. Abdel-Wahab,</w:t>
+        <w:t>[4</w:t>
+      </w:r>
+      <w:r>
+        <w:t xml:space="preserve">]</w:t>
+      </w:r>
+      <w:r>
+        <w:t xml:space="preserve"> I. Stoica and H. Abdel-Wahab,</w:t>
       </w:r>
       <w:r>
         <w:t xml:space="preserve"> </w:t>
@@ -20727,7 +20775,13 @@
         <w:pStyle w:val="BodyText"/>
       </w:pPr>
       <w:r>
-        <w:t xml:space="preserve">J. Corbet,</w:t>
+        <w:t>[5</w:t>
+      </w:r>
+      <w:r>
+        <w:t xml:space="preserve">]</w:t>
+      </w:r>
+      <w:r>
+        <w:t xml:space="preserve"> J. Corbet,</w:t>
       </w:r>
       <w:r>
         <w:t xml:space="preserve"> </w:t>
@@ -20794,7 +20848,13 @@
         <w:pStyle w:val="BodyText"/>
       </w:pPr>
       <w:r>
-        <w:t xml:space="preserve">——,</w:t>
+        <w:t>[6</w:t>
+      </w:r>
+      <w:r>
+        <w:t xml:space="preserve">]</w:t>
+      </w:r>
+      <w:r>
+        <w:t xml:space="preserve"> J. Corbet,</w:t>
       </w:r>
       <w:r>
         <w:t xml:space="preserve"> </w:t>
@@ -20838,13 +20898,25 @@
         </w:r>
       </w:hyperlink>
       <w:r>
-        <w:t xml:space="preserve">, 2024.</w:t>
+        <w:t xml:space="preserve">.</w:t>
       </w:r>
     </w:p>
     <w:p>
       <w:pPr>
         <w:pStyle w:val="BodyText"/>
       </w:pPr>
+      <w:r>
+        <w:t>[7</w:t>
+      </w:r>
+      <w:r>
+        <w:t xml:space="preserve">]</w:t>
+      </w:r>
+      <w:r>
+        <w:t xml:space="preserve"> </w:t>
+      </w:r>
+      <w:r>
+        <w:t xml:space="preserve">The Linux kernel documentation</w:t>
+      </w:r>
       <w:r>
         <w:t xml:space="preserve">,</w:t>
       </w:r>
@@ -20886,7 +20958,13 @@
         <w:pStyle w:val="BodyText"/>
       </w:pPr>
       <w:r>
-        <w:t xml:space="preserve">B. O. Koopman,</w:t>
+        <w:t>[8</w:t>
+      </w:r>
+      <w:r>
+        <w:t xml:space="preserve">]</w:t>
+      </w:r>
+      <w:r>
+        <w:t xml:space="preserve"> B. O. Koopman,</w:t>
       </w:r>
       <w:r>
         <w:t xml:space="preserve"> </w:t>
@@ -20931,7 +21009,13 @@
         <w:pStyle w:val="BodyText"/>
       </w:pPr>
       <w:r>
-        <w:t xml:space="preserve">I. Mezić,</w:t>
+        <w:t>[9</w:t>
+      </w:r>
+      <w:r>
+        <w:t xml:space="preserve">]</w:t>
+      </w:r>
+      <w:r>
+        <w:t xml:space="preserve"> I. Mezić,</w:t>
       </w:r>
       <w:r>
         <w:t xml:space="preserve"> </w:t>
@@ -20964,7 +21048,13 @@
         <w:pStyle w:val="BodyText"/>
       </w:pPr>
       <w:r>
-        <w:t xml:space="preserve">S. L. Brunton, M. Budišić, E. Kaiser, and J. N. Kutz,</w:t>
+        <w:t>[10</w:t>
+      </w:r>
+      <w:r>
+        <w:t xml:space="preserve">]</w:t>
+      </w:r>
+      <w:r>
+        <w:t xml:space="preserve"> S. L. Brunton, M. Budišić, E. Kaiser, and J. N. Kutz,</w:t>
       </w:r>
       <w:r>
         <w:t xml:space="preserve"> </w:t>
@@ -21009,7 +21099,13 @@
         <w:pStyle w:val="BodyText"/>
       </w:pPr>
       <w:r>
-        <w:t xml:space="preserve">P. J. Schmid,</w:t>
+        <w:t>[11</w:t>
+      </w:r>
+      <w:r>
+        <w:t xml:space="preserve">]</w:t>
+      </w:r>
+      <w:r>
+        <w:t xml:space="preserve"> P. J. Schmid,</w:t>
       </w:r>
       <w:r>
         <w:t xml:space="preserve"> </w:t>
@@ -21042,7 +21138,13 @@
         <w:pStyle w:val="BodyText"/>
       </w:pPr>
       <w:r>
-        <w:t xml:space="preserve">M. O. Williams, I. G. Kevrekidis, and C. W. Rowley,</w:t>
+        <w:t>[12</w:t>
+      </w:r>
+      <w:r>
+        <w:t xml:space="preserve">]</w:t>
+      </w:r>
+      <w:r>
+        <w:t xml:space="preserve"> M. O. Williams, I. G. Kevrekidis, and C. W. Rowley,</w:t>
       </w:r>
       <w:r>
         <w:t xml:space="preserve"> </w:t>
@@ -21087,7 +21189,13 @@
         <w:pStyle w:val="BodyText"/>
       </w:pPr>
       <w:r>
-        <w:t xml:space="preserve">H. Arbabi and I. Mezić,</w:t>
+        <w:t>[13</w:t>
+      </w:r>
+      <w:r>
+        <w:t xml:space="preserve">]</w:t>
+      </w:r>
+      <w:r>
+        <w:t xml:space="preserve"> H. Arbabi and I. Mezić,</w:t>
       </w:r>
       <w:r>
         <w:t xml:space="preserve"> </w:t>
@@ -21132,7 +21240,13 @@
         <w:pStyle w:val="BodyText"/>
       </w:pPr>
       <w:r>
-        <w:t xml:space="preserve">S. Pan and K. Duraisamy,</w:t>
+        <w:t>[14</w:t>
+      </w:r>
+      <w:r>
+        <w:t xml:space="preserve">]</w:t>
+      </w:r>
+      <w:r>
+        <w:t xml:space="preserve"> S. Pan and K. Duraisamy,</w:t>
       </w:r>
       <w:r>
         <w:t xml:space="preserve"> </w:t>
@@ -21165,7 +21279,13 @@
         <w:pStyle w:val="BodyText"/>
       </w:pPr>
       <w:r>
-        <w:t xml:space="preserve">R. G. Brown,</w:t>
+        <w:t>[15</w:t>
+      </w:r>
+      <w:r>
+        <w:t xml:space="preserve">]</w:t>
+      </w:r>
+      <w:r>
+        <w:t xml:space="preserve"> R. G. Brown,</w:t>
       </w:r>
       <w:r>
         <w:t xml:space="preserve"> </w:t>
@@ -21186,7 +21306,13 @@
         <w:pStyle w:val="BodyText"/>
       </w:pPr>
       <w:r>
-        <w:t xml:space="preserve">S. W. Roberts,</w:t>
+        <w:t>[16</w:t>
+      </w:r>
+      <w:r>
+        <w:t xml:space="preserve">]</w:t>
+      </w:r>
+      <w:r>
+        <w:t xml:space="preserve"> S. W. Roberts,</w:t>
       </w:r>
       <w:r>
         <w:t xml:space="preserve"> </w:t>
@@ -21219,7 +21345,13 @@
         <w:pStyle w:val="BodyText"/>
       </w:pPr>
       <w:r>
-        <w:t xml:space="preserve">J. H. Tu, C. W. Rowley, D. M. Luchtenburg, S. L. Brunton, and J. N. Kutz,</w:t>
+        <w:t>[17</w:t>
+      </w:r>
+      <w:r>
+        <w:t xml:space="preserve">]</w:t>
+      </w:r>
+      <w:r>
+        <w:t xml:space="preserve"> J. H. Tu, C. W. Rowley, D. M. Luchtenburg, S. L. Brunton, and J. N. Kutz,</w:t>
       </w:r>
       <w:r>
         <w:t xml:space="preserve"> </w:t>
@@ -21252,7 +21384,13 @@
         <w:pStyle w:val="BodyText"/>
       </w:pPr>
       <w:r>
-        <w:t xml:space="preserve">M. Korda and I. Mezić,</w:t>
+        <w:t>[18</w:t>
+      </w:r>
+      <w:r>
+        <w:t xml:space="preserve">]</w:t>
+      </w:r>
+      <w:r>
+        <w:t xml:space="preserve"> M. Korda and I. Mezić,</w:t>
       </w:r>
       <w:r>
         <w:t xml:space="preserve"> </w:t>
@@ -21297,7 +21435,13 @@
         <w:pStyle w:val="BodyText"/>
       </w:pPr>
       <w:r>
-        <w:t xml:space="preserve">F. Takens,</w:t>
+        <w:t>[19</w:t>
+      </w:r>
+      <w:r>
+        <w:t xml:space="preserve">]</w:t>
+      </w:r>
+      <w:r>
+        <w:t xml:space="preserve"> F. Takens,</w:t>
       </w:r>
       <w:r>
         <w:t xml:space="preserve"> </w:t>
@@ -21336,7 +21480,13 @@
         <w:pStyle w:val="BodyText"/>
       </w:pPr>
       <w:r>
-        <w:t xml:space="preserve">S. L. Brunton, B. W. Brunton, J. L. Proctor, E. Kaiser, and J. N. Kutz,</w:t>
+        <w:t>[20</w:t>
+      </w:r>
+      <w:r>
+        <w:t xml:space="preserve">]</w:t>
+      </w:r>
+      <w:r>
+        <w:t xml:space="preserve"> S. L. Brunton, B. W. Brunton, J. L. Proctor, E. Kaiser, and J. N. Kutz,</w:t>
       </w:r>
       <w:r>
         <w:t xml:space="preserve"> </w:t>
@@ -21369,7 +21519,13 @@
         <w:pStyle w:val="BodyText"/>
       </w:pPr>
       <w:r>
-        <w:t xml:space="preserve">S. T. M. Dawson, M. S. Hemati, M. O. Williams, and C. W. Rowley,</w:t>
+        <w:t>[21</w:t>
+      </w:r>
+      <w:r>
+        <w:t xml:space="preserve">]</w:t>
+      </w:r>
+      <w:r>
+        <w:t xml:space="preserve"> S. T. M. Dawson, M. S. Hemati, M. O. Williams, and C. W. Rowley,</w:t>
       </w:r>
       <w:r>
         <w:t xml:space="preserve"> </w:t>
@@ -21402,7 +21558,13 @@
         <w:pStyle w:val="BodyText"/>
       </w:pPr>
       <w:r>
-        <w:t xml:space="preserve">J. N. Kutz, S. L. Brunton, B. W. Brunton, and J. L. Proctor,</w:t>
+        <w:t>[22</w:t>
+      </w:r>
+      <w:r>
+        <w:t xml:space="preserve">]</w:t>
+      </w:r>
+      <w:r>
+        <w:t xml:space="preserve"> J. N. Kutz, S. L. Brunton, B. W. Brunton, and J. L. Proctor,</w:t>
       </w:r>
       <w:r>
         <w:t xml:space="preserve"> </w:t>
@@ -21423,7 +21585,13 @@
         <w:pStyle w:val="BodyText"/>
       </w:pPr>
       <w:r>
-        <w:t xml:space="preserve">J. Mann and J. N. Kutz,</w:t>
+        <w:t>[23</w:t>
+      </w:r>
+      <w:r>
+        <w:t xml:space="preserve">]</w:t>
+      </w:r>
+      <w:r>
+        <w:t xml:space="preserve"> J. Mann and J. N. Kutz,</w:t>
       </w:r>
       <w:r>
         <w:t xml:space="preserve"> </w:t>
@@ -21456,7 +21624,13 @@
         <w:pStyle w:val="BodyText"/>
       </w:pPr>
       <w:r>
-        <w:t xml:space="preserve">M. Korda and I. Mezi</w:t>
+        <w:t>[24</w:t>
+      </w:r>
+      <w:r>
+        <w:t xml:space="preserve">]</w:t>
+      </w:r>
+      <w:r>
+        <w:t xml:space="preserve"> M. Korda and I. Mezi</w:t>
       </w:r>
       <w:r>
         <w:t xml:space="preserve">ć</w:t>
@@ -21507,7 +21681,13 @@
         <w:pStyle w:val="BodyText"/>
       </w:pPr>
       <w:r>
-        <w:t xml:space="preserve">B. Lusch, J. N. Kutz, and S. L. Brunton,</w:t>
+        <w:t>[25</w:t>
+      </w:r>
+      <w:r>
+        <w:t xml:space="preserve">]</w:t>
+      </w:r>
+      <w:r>
+        <w:t xml:space="preserve"> B. Lusch, J. N. Kutz, and S. L. Brunton,</w:t>
       </w:r>
       <w:r>
         <w:t xml:space="preserve"> </w:t>
@@ -21540,7 +21720,13 @@
         <w:pStyle w:val="BodyText"/>
       </w:pPr>
       <w:r>
-        <w:t xml:space="preserve">B. Gregg,</w:t>
+        <w:t>[26</w:t>
+      </w:r>
+      <w:r>
+        <w:t xml:space="preserve">]</w:t>
+      </w:r>
+      <w:r>
+        <w:t xml:space="preserve"> B. Gregg,</w:t>
       </w:r>
       <w:r>
         <w:t xml:space="preserve"> </w:t>
@@ -21574,6 +21760,18 @@
       <w:pPr>
         <w:pStyle w:val="BodyText"/>
       </w:pPr>
+      <w:r>
+        <w:t>[27</w:t>
+      </w:r>
+      <w:r>
+        <w:t xml:space="preserve">]</w:t>
+      </w:r>
+      <w:r>
+        <w:t xml:space="preserve"> </w:t>
+      </w:r>
+      <w:r>
+        <w:t xml:space="preserve">The Linux kernel documentation</w:t>
+      </w:r>
       <w:r>
         <w:t xml:space="preserve">,</w:t>
       </w:r>
@@ -21609,7 +21807,13 @@
         <w:pStyle w:val="BodyText"/>
       </w:pPr>
       <w:r>
-        <w:t xml:space="preserve">A. Negi and P. K. Kumar,</w:t>
+        <w:t>[28</w:t>
+      </w:r>
+      <w:r>
+        <w:t xml:space="preserve">]</w:t>
+      </w:r>
+      <w:r>
+        <w:t xml:space="preserve"> A. Negi and P. K. Kumar,</w:t>
       </w:r>
       <w:r>
         <w:t xml:space="preserve"> </w:t>
@@ -21660,7 +21864,13 @@
         <w:pStyle w:val="BodyText"/>
       </w:pPr>
       <w:r>
-        <w:t xml:space="preserve">M. Harchol-Balter, B. Schroeder, N. Bansal, and M. Agrawal,</w:t>
+        <w:t>[29</w:t>
+      </w:r>
+      <w:r>
+        <w:t xml:space="preserve">]</w:t>
+      </w:r>
+      <w:r>
+        <w:t xml:space="preserve"> M. Harchol-Balter, B. Schroeder, N. Bansal, and M. Agrawal,</w:t>
       </w:r>
       <w:r>
         <w:t xml:space="preserve"> </w:t>
@@ -21693,7 +21903,13 @@
         <w:pStyle w:val="BodyText"/>
       </w:pPr>
       <w:r>
-        <w:t xml:space="preserve">H. Mao, M. Schwarzkopf, S. B. Venkatakrishnan, Z. Meng, and M. Alizadeh,</w:t>
+        <w:t>[30</w:t>
+      </w:r>
+      <w:r>
+        <w:t xml:space="preserve">]</w:t>
+      </w:r>
+      <w:r>
+        <w:t xml:space="preserve"> H. Mao, M. Schwarzkopf, S. B. Venkatakrishnan, Z. Meng, and M. Alizadeh,</w:t>
       </w:r>
       <w:r>
         <w:t xml:space="preserve"> </w:t>
@@ -21732,7 +21948,13 @@
         <w:pStyle w:val="BodyText"/>
       </w:pPr>
       <w:r>
-        <w:t xml:space="preserve">X. Wang, S. Jia, J. Cao, Z. Huang, and M. Song,</w:t>
+        <w:t>[31</w:t>
+      </w:r>
+      <w:r>
+        <w:t xml:space="preserve">]</w:t>
+      </w:r>
+      <w:r>
+        <w:t xml:space="preserve"> X. Wang, S. Jia, J. Cao, Z. Huang, and M. Song,</w:t>
       </w:r>
       <w:r>
         <w:t xml:space="preserve"> </w:t>
@@ -21758,7 +21980,13 @@
         <w:pStyle w:val="BodyText"/>
       </w:pPr>
       <w:r>
-        <w:t xml:space="preserve">J.-P. Lozi, B. Lepers, J. Funston, F. Gaud, V. Qu</w:t>
+        <w:t>[32</w:t>
+      </w:r>
+      <w:r>
+        <w:t xml:space="preserve">]</w:t>
+      </w:r>
+      <w:r>
+        <w:t xml:space="preserve"> J.-P. Lozi, B. Lepers, J. Funston, F. Gaud, V. Qu</w:t>
       </w:r>
       <w:r>
         <w:t xml:space="preserve">é</w:t>
@@ -21815,7 +22043,13 @@
         <w:pStyle w:val="BodyText"/>
       </w:pPr>
       <w:r>
-        <w:t xml:space="preserve">G. E. P. Box, G. M. Jenkins, G. C. Reinsel, and G. M. Ljung,</w:t>
+        <w:t>[33</w:t>
+      </w:r>
+      <w:r>
+        <w:t xml:space="preserve">]</w:t>
+      </w:r>
+      <w:r>
+        <w:t xml:space="preserve"> G. E. P. Box, G. M. Jenkins, G. C. Reinsel, and G. M. Ljung,</w:t>
       </w:r>
       <w:r>
         <w:t xml:space="preserve"> </w:t>
@@ -21836,7 +22070,13 @@
         <w:pStyle w:val="BodyText"/>
       </w:pPr>
       <w:r>
-        <w:t xml:space="preserve">H. Akaike,</w:t>
+        <w:t>[34</w:t>
+      </w:r>
+      <w:r>
+        <w:t xml:space="preserve">]</w:t>
+      </w:r>
+      <w:r>
+        <w:t xml:space="preserve"> H. Akaike,</w:t>
       </w:r>
       <w:r>
         <w:t xml:space="preserve"> </w:t>
@@ -21869,7 +22109,13 @@
         <w:pStyle w:val="BodyText"/>
       </w:pPr>
       <w:r>
-        <w:t xml:space="preserve">V. Vovk, A. Gammerman, and G. Shafer,</w:t>
+        <w:t>[35</w:t>
+      </w:r>
+      <w:r>
+        <w:t xml:space="preserve">]</w:t>
+      </w:r>
+      <w:r>
+        <w:t xml:space="preserve"> V. Vovk, A. Gammerman, and G. Shafer,</w:t>
       </w:r>
       <w:r>
         <w:t xml:space="preserve"> </w:t>
@@ -21890,7 +22136,13 @@
         <w:pStyle w:val="BodyText"/>
       </w:pPr>
       <w:r>
-        <w:t xml:space="preserve">A. N. Angelopoulos and S. Bates,</w:t>
+        <w:t>[36</w:t>
+      </w:r>
+      <w:r>
+        <w:t xml:space="preserve">]</w:t>
+      </w:r>
+      <w:r>
+        <w:t xml:space="preserve"> A. N. Angelopoulos and S. Bates,</w:t>
       </w:r>
       <w:r>
         <w:t xml:space="preserve"> </w:t>
@@ -21923,7 +22175,13 @@
         <w:pStyle w:val="BodyText"/>
       </w:pPr>
       <w:r>
-        <w:t xml:space="preserve">H. R. Künsch,</w:t>
+        <w:t>[37</w:t>
+      </w:r>
+      <w:r>
+        <w:t xml:space="preserve">]</w:t>
+      </w:r>
+      <w:r>
+        <w:t xml:space="preserve"> H. R. Künsch,</w:t>
       </w:r>
       <w:r>
         <w:t xml:space="preserve"> </w:t>
@@ -21956,7 +22214,13 @@
         <w:pStyle w:val="BodyText"/>
       </w:pPr>
       <w:r>
-        <w:t xml:space="preserve">S. Holm,</w:t>
+        <w:t>[38</w:t>
+      </w:r>
+      <w:r>
+        <w:t xml:space="preserve">]</w:t>
+      </w:r>
+      <w:r>
+        <w:t xml:space="preserve"> S. Holm,</w:t>
       </w:r>
       <w:r>
         <w:t xml:space="preserve"> </w:t>
@@ -21989,7 +22253,13 @@
         <w:pStyle w:val="BodyText"/>
       </w:pPr>
       <w:r>
-        <w:t xml:space="preserve">F. Wilcoxon,</w:t>
+        <w:t>[39</w:t>
+      </w:r>
+      <w:r>
+        <w:t xml:space="preserve">]</w:t>
+      </w:r>
+      <w:r>
+        <w:t xml:space="preserve"> F. Wilcoxon,</w:t>
       </w:r>
       <w:r>
         <w:t xml:space="preserve"> </w:t>
@@ -22022,7 +22292,13 @@
         <w:pStyle w:val="BodyText"/>
       </w:pPr>
       <w:r>
-        <w:t xml:space="preserve">S. Manocha, R. R. Lingala, C. S. M. Sadhana, S. Kedia, C. S. M. Sahithi, and P. Vemuri,</w:t>
+        <w:t>[40</w:t>
+      </w:r>
+      <w:r>
+        <w:t xml:space="preserve">]</w:t>
+      </w:r>
+      <w:r>
+        <w:t xml:space="preserve"> S. Manocha, R. R. Lingala, C. S. M. Sadhana, S. Kedia, C. S. M. Sahithi, and P. Vemuri,</w:t>
       </w:r>
       <w:r>
         <w:t xml:space="preserve"> </w:t>
@@ -22054,7 +22330,13 @@
         <w:pStyle w:val="BodyText"/>
       </w:pPr>
       <w:r>
-        <w:t xml:space="preserve">I. Sharafaldin, A. H. Lashkari, and A. A. Ghorbani,</w:t>
+        <w:t>[41</w:t>
+      </w:r>
+      <w:r>
+        <w:t xml:space="preserve">]</w:t>
+      </w:r>
+      <w:r>
+        <w:t xml:space="preserve"> I. Sharafaldin, A. H. Lashkari, and A. A. Ghorbani,</w:t>
       </w:r>
       <w:r>
         <w:t xml:space="preserve"> </w:t>
@@ -22093,7 +22375,13 @@
         <w:pStyle w:val="BodyText"/>
       </w:pPr>
       <w:r>
-        <w:t xml:space="preserve">N. Moustafa and J. Slay,</w:t>
+        <w:t>[42</w:t>
+      </w:r>
+      <w:r>
+        <w:t xml:space="preserve">]</w:t>
+      </w:r>
+      <w:r>
+        <w:t xml:space="preserve"> N. Moustafa and J. Slay,</w:t>
       </w:r>
       <w:r>
         <w:t xml:space="preserve"> </w:t>
@@ -22135,7 +22423,13 @@
         <w:pStyle w:val="BodyText"/>
       </w:pPr>
       <w:r>
-        <w:t xml:space="preserve">S. Manocha,</w:t>
+        <w:t>[43</w:t>
+      </w:r>
+      <w:r>
+        <w:t xml:space="preserve">]</w:t>
+      </w:r>
+      <w:r>
+        <w:t xml:space="preserve"> S. Manocha,</w:t>
       </w:r>
       <w:r>
         <w:t xml:space="preserve"> </w:t>
@@ -22178,7 +22472,13 @@
         <w:pStyle w:val="BodyText"/>
       </w:pPr>
       <w:r>
-        <w:t xml:space="preserve">R. R. Coifman and S. Lafon,</w:t>
+        <w:t>[44</w:t>
+      </w:r>
+      <w:r>
+        <w:t xml:space="preserve">]</w:t>
+      </w:r>
+      <w:r>
+        <w:t xml:space="preserve"> R. R. Coifman and S. Lafon,</w:t>
       </w:r>
       <w:r>
         <w:t xml:space="preserve"> </w:t>

</xml_diff>